<commit_message>
cv-tailoring: monochrome Helvetica CV design, cover letter builder
Redesign the CV build: Helvetica Neue, monochrome, bold sentence-case
headings with no rules or colour, dates aligned to the right margin.
The previous Calibri and slate-blue layout matched a widely used template.

- Add build_cover_letter.js, which builds letters in the same design and
  reads the header from base_cv.md
- docx_to_pdf.sh closes an already-open copy in Word before exporting,
  so a stale document is never converted
- Reword the base CV opening line to remove the repeated "build"
- Rewrite the Visual Style section of principles.md
- Include pending master, interview prep and methodology updates from
  recent application rounds

Co-Authored-By: Claude Opus 5.5 <noreply@anthropic.com>
</commit_message>
<xml_diff>
--- a/cv-tailoring/source/base_cv.docx
+++ b/cv-tailoring/source/base_cv.docx
@@ -8,12 +8,12 @@
       </w:pPr>
       <w:r>
         <w:rPr>
-          <w:rFonts w:ascii="Calibri" w:cs="Calibri" w:eastAsia="Calibri" w:hAnsi="Calibri"/>
-          <w:b/>
-          <w:bCs/>
-          <w:color w:val="1A1A1A"/>
-          <w:sz w:val="40"/>
-          <w:szCs w:val="40"/>
+          <w:rFonts w:ascii="Helvetica Neue" w:cs="Helvetica Neue" w:eastAsia="Helvetica Neue" w:hAnsi="Helvetica Neue"/>
+          <w:b/>
+          <w:bCs/>
+          <w:color w:val="161616"/>
+          <w:sz w:val="48"/>
+          <w:szCs w:val="48"/>
         </w:rPr>
         <w:t xml:space="preserve">Gil Strauss</w:t>
       </w:r>
@@ -24,48 +24,44 @@
       </w:pPr>
       <w:r>
         <w:rPr>
-          <w:rFonts w:ascii="Calibri" w:cs="Calibri" w:eastAsia="Calibri" w:hAnsi="Calibri"/>
-          <w:b/>
-          <w:bCs/>
-          <w:color w:val="2E5C8A"/>
-          <w:sz w:val="24"/>
-          <w:szCs w:val="24"/>
-        </w:rPr>
-        <w:t xml:space="preserve">Chief Technology Officer · VP R&amp;D · Chief Architect</w:t>
-      </w:r>
-    </w:p>
-    <w:p>
-      <w:pPr>
-        <w:spacing w:after="0" w:before="40"/>
-      </w:pPr>
-      <w:r>
-        <w:rPr>
-          <w:rFonts w:ascii="Calibri" w:cs="Calibri" w:eastAsia="Calibri" w:hAnsi="Calibri"/>
-          <w:color w:val="555555"/>
-          <w:sz w:val="20"/>
-          <w:szCs w:val="20"/>
-        </w:rPr>
-        <w:t xml:space="preserve">Petah Tikva, Israel · gil.strauss@me.com · +972-54-623-1694 · linkedin.com/in/gil-strauss</w:t>
-      </w:r>
-    </w:p>
-    <w:p>
-      <w:pPr>
-        <w:pBdr>
-          <w:bottom w:val="single" w:color="2E5C8A" w:sz="6" w:space="2"/>
-        </w:pBdr>
-        <w:spacing w:after="40" w:before="140"/>
-      </w:pPr>
-      <w:r>
-        <w:rPr>
-          <w:rFonts w:ascii="Calibri" w:cs="Calibri" w:eastAsia="Calibri" w:hAnsi="Calibri"/>
-          <w:b/>
-          <w:bCs/>
-          <w:color w:val="2E5C8A"/>
-          <w:spacing w:val="40"/>
+          <w:rFonts w:ascii="Helvetica Neue" w:cs="Helvetica Neue" w:eastAsia="Helvetica Neue" w:hAnsi="Helvetica Neue"/>
+          <w:b/>
+          <w:bCs/>
+          <w:color w:val="161616"/>
           <w:sz w:val="22"/>
           <w:szCs w:val="22"/>
         </w:rPr>
-        <w:t xml:space="preserve">PROFILE</w:t>
+        <w:t xml:space="preserve">Chief Technology Officer · VP R&amp;D · Chief Architect</w:t>
+      </w:r>
+    </w:p>
+    <w:p>
+      <w:pPr>
+        <w:spacing w:after="40" w:before="40"/>
+      </w:pPr>
+      <w:r>
+        <w:rPr>
+          <w:rFonts w:ascii="Helvetica Neue" w:cs="Helvetica Neue" w:eastAsia="Helvetica Neue" w:hAnsi="Helvetica Neue"/>
+          <w:color w:val="5A5A5A"/>
+          <w:sz w:val="20"/>
+          <w:szCs w:val="20"/>
+        </w:rPr>
+        <w:t xml:space="preserve">Petah Tikva, Israel · gil.strauss@me.com · +972-54-623-1694 · linkedin.com/in/gil-strauss</w:t>
+      </w:r>
+    </w:p>
+    <w:p>
+      <w:pPr>
+        <w:spacing w:after="60" w:before="200"/>
+      </w:pPr>
+      <w:r>
+        <w:rPr>
+          <w:rFonts w:ascii="Helvetica Neue" w:cs="Helvetica Neue" w:eastAsia="Helvetica Neue" w:hAnsi="Helvetica Neue"/>
+          <w:b/>
+          <w:bCs/>
+          <w:color w:val="161616"/>
+          <w:sz w:val="26"/>
+          <w:szCs w:val="26"/>
+        </w:rPr>
+        <w:t xml:space="preserve">Profile</w:t>
       </w:r>
     </w:p>
     <w:p>
@@ -74,75 +70,71 @@
       </w:pPr>
       <w:r>
         <w:rPr>
-          <w:rFonts w:ascii="Calibri" w:cs="Calibri" w:eastAsia="Calibri" w:hAnsi="Calibri"/>
-          <w:color w:val="1A1A1A"/>
-          <w:sz w:val="21"/>
-          <w:szCs w:val="21"/>
-        </w:rPr>
-        <w:t xml:space="preserve">I build the engineering organizations that build mission-critical systems — and I stay in the code while doing it. Over 20 years, that has meant taking a B2B SaaS platform from greenfield to hundreds of millions of daily transactions, scaling a 10-person team to 60 across five functions, and driving a six-year transformation to DORA-elite engineering performance. Today I am doing the same work in a different domain: modernizing legacy platforms and embedding AI-augmented engineering culture at the organization that powers K-12 education for over 1M Israeli students. Hands-on in the modern sense — architecture, specs, design and code review, and AI-augmented engineering with tools like Claude Code.</w:t>
-      </w:r>
-    </w:p>
-    <w:p>
-      <w:pPr>
-        <w:pBdr>
-          <w:bottom w:val="single" w:color="2E5C8A" w:sz="6" w:space="2"/>
-        </w:pBdr>
-        <w:spacing w:after="40" w:before="140"/>
-      </w:pPr>
-      <w:r>
-        <w:rPr>
-          <w:rFonts w:ascii="Calibri" w:cs="Calibri" w:eastAsia="Calibri" w:hAnsi="Calibri"/>
-          <w:b/>
-          <w:bCs/>
-          <w:color w:val="2E5C8A"/>
-          <w:spacing w:val="40"/>
+          <w:rFonts w:ascii="Helvetica Neue" w:cs="Helvetica Neue" w:eastAsia="Helvetica Neue" w:hAnsi="Helvetica Neue"/>
+          <w:color w:val="161616"/>
+          <w:sz w:val="20"/>
+          <w:szCs w:val="20"/>
+        </w:rPr>
+        <w:t xml:space="preserve">I build the engineering organizations behind mission-critical systems, without ever leaving the code. Over fourteen years at one company I took a B2B SaaS platform from greenfield to hundreds of millions of daily transactions, built the group that ran it, and drove it to DORA-elite performance. In the same period I took as much as a quarter out of cloud spend while volume rose. Today I am doing the same work in a different domain: legacy modernization and culture change at an EdTech company whose products reach over 1M K-12 students in Israel. I review architecture and code, write the specs for the hard problems, and build alongside coding agents.</w:t>
+      </w:r>
+    </w:p>
+    <w:p>
+      <w:pPr>
+        <w:spacing w:after="60" w:before="200"/>
+      </w:pPr>
+      <w:r>
+        <w:rPr>
+          <w:rFonts w:ascii="Helvetica Neue" w:cs="Helvetica Neue" w:eastAsia="Helvetica Neue" w:hAnsi="Helvetica Neue"/>
+          <w:b/>
+          <w:bCs/>
+          <w:color w:val="161616"/>
+          <w:sz w:val="26"/>
+          <w:szCs w:val="26"/>
+        </w:rPr>
+        <w:t xml:space="preserve">Experience</w:t>
+      </w:r>
+    </w:p>
+    <w:p>
+      <w:pPr>
+        <w:tabs>
+          <w:tab w:val="right" w:pos="10080"/>
+        </w:tabs>
+        <w:spacing w:after="0" w:before="80"/>
+      </w:pPr>
+      <w:r>
+        <w:rPr>
+          <w:rFonts w:ascii="Helvetica Neue" w:cs="Helvetica Neue" w:eastAsia="Helvetica Neue" w:hAnsi="Helvetica Neue"/>
+          <w:b/>
+          <w:bCs/>
+          <w:color w:val="161616"/>
           <w:sz w:val="22"/>
           <w:szCs w:val="22"/>
         </w:rPr>
-        <w:t xml:space="preserve">EXPERIENCE</w:t>
-      </w:r>
-    </w:p>
-    <w:p>
-      <w:pPr>
-        <w:tabs>
-          <w:tab w:val="right" w:pos="9026"/>
-        </w:tabs>
-        <w:spacing w:after="0" w:before="80"/>
-      </w:pPr>
-      <w:r>
-        <w:rPr>
-          <w:rFonts w:ascii="Calibri" w:cs="Calibri" w:eastAsia="Calibri" w:hAnsi="Calibri"/>
-          <w:b/>
-          <w:bCs/>
-          <w:color w:val="1A1A1A"/>
-          <w:sz w:val="23"/>
-          <w:szCs w:val="23"/>
-        </w:rPr>
         <w:t xml:space="preserve">Chief Technology Officer</w:t>
       </w:r>
       <w:r>
         <w:rPr>
-          <w:rFonts w:ascii="Calibri" w:cs="Calibri" w:eastAsia="Calibri" w:hAnsi="Calibri"/>
-          <w:color w:val="1A1A1A"/>
-          <w:sz w:val="23"/>
-          <w:szCs w:val="23"/>
-        </w:rPr>
-        <w:t xml:space="preserve">  ·  Center for Educational Technology (CET)</w:t>
-      </w:r>
-      <w:r>
-        <w:rPr>
-          <w:rFonts w:ascii="Calibri" w:cs="Calibri" w:eastAsia="Calibri" w:hAnsi="Calibri"/>
-          <w:sz w:val="23"/>
-          <w:szCs w:val="23"/>
+          <w:rFonts w:ascii="Helvetica Neue" w:cs="Helvetica Neue" w:eastAsia="Helvetica Neue" w:hAnsi="Helvetica Neue"/>
+          <w:color w:val="161616"/>
+          <w:sz w:val="22"/>
+          <w:szCs w:val="22"/>
+        </w:rPr>
+        <w:t xml:space="preserve">  |  Center for Educational Technology (CET)</w:t>
+      </w:r>
+      <w:r>
+        <w:rPr>
+          <w:rFonts w:ascii="Helvetica Neue" w:cs="Helvetica Neue" w:eastAsia="Helvetica Neue" w:hAnsi="Helvetica Neue"/>
+          <w:sz w:val="22"/>
+          <w:szCs w:val="22"/>
         </w:rPr>
         <w:t xml:space="preserve">	</w:t>
       </w:r>
       <w:r>
         <w:rPr>
-          <w:rFonts w:ascii="Calibri" w:cs="Calibri" w:eastAsia="Calibri" w:hAnsi="Calibri"/>
-          <w:color w:val="555555"/>
-          <w:sz w:val="21"/>
-          <w:szCs w:val="21"/>
+          <w:rFonts w:ascii="Helvetica Neue" w:cs="Helvetica Neue" w:eastAsia="Helvetica Neue" w:hAnsi="Helvetica Neue"/>
+          <w:color w:val="5A5A5A"/>
+          <w:sz w:val="22"/>
+          <w:szCs w:val="22"/>
         </w:rPr>
         <w:t xml:space="preserve">Tel Aviv · Aug 2025 – Present</w:t>
       </w:r>
@@ -153,12 +145,12 @@
       </w:pPr>
       <w:r>
         <w:rPr>
-          <w:rFonts w:ascii="Calibri" w:cs="Calibri" w:eastAsia="Calibri" w:hAnsi="Calibri"/>
-          <w:color w:val="1A1A1A"/>
-          <w:sz w:val="21"/>
-          <w:szCs w:val="21"/>
-        </w:rPr>
-        <w:t xml:space="preserve">Israel's leading K-12 educational technology organization, reaching over 1M students. Architect-strategist CTO with cross-functional influence across a 60-person technology organization.</w:t>
+          <w:rFonts w:ascii="Helvetica Neue" w:cs="Helvetica Neue" w:eastAsia="Helvetica Neue" w:hAnsi="Helvetica Neue"/>
+          <w:color w:val="161616"/>
+          <w:sz w:val="20"/>
+          <w:szCs w:val="20"/>
+        </w:rPr>
+        <w:t xml:space="preserve">Israel's leading independent EdTech company. Architect-strategist CTO across the platform portfolio.</w:t>
       </w:r>
     </w:p>
     <w:p>
@@ -172,12 +164,12 @@
       </w:pPr>
       <w:r>
         <w:rPr>
-          <w:rFonts w:ascii="Calibri" w:cs="Calibri" w:eastAsia="Calibri" w:hAnsi="Calibri"/>
-          <w:color w:val="1A1A1A"/>
-          <w:sz w:val="21"/>
-          <w:szCs w:val="21"/>
-        </w:rPr>
-        <w:t xml:space="preserve">Shipped LLM-powered educational features (RAG, MCP) and a multi-agent code review system adopted across R&amp;D.</w:t>
+          <w:rFonts w:ascii="Helvetica Neue" w:cs="Helvetica Neue" w:eastAsia="Helvetica Neue" w:hAnsi="Helvetica Neue"/>
+          <w:color w:val="161616"/>
+          <w:sz w:val="20"/>
+          <w:szCs w:val="20"/>
+        </w:rPr>
+        <w:t xml:space="preserve">Co-designed an LLM-based content classification and analysis pipeline, and shipped educational features built on RAG, tool use, and MCP.</w:t>
       </w:r>
     </w:p>
     <w:p>
@@ -191,12 +183,12 @@
       </w:pPr>
       <w:r>
         <w:rPr>
-          <w:rFonts w:ascii="Calibri" w:cs="Calibri" w:eastAsia="Calibri" w:hAnsi="Calibri"/>
-          <w:color w:val="1A1A1A"/>
-          <w:sz w:val="21"/>
-          <w:szCs w:val="21"/>
-        </w:rPr>
-        <w:t xml:space="preserve">Driving organization-wide adoption of AI-augmented engineering practices, tooling, and the measurement framework to track them.</w:t>
+          <w:rFonts w:ascii="Helvetica Neue" w:cs="Helvetica Neue" w:eastAsia="Helvetica Neue" w:hAnsi="Helvetica Neue"/>
+          <w:color w:val="161616"/>
+          <w:sz w:val="20"/>
+          <w:szCs w:val="20"/>
+        </w:rPr>
+        <w:t xml:space="preserve">Driving organization-wide adoption of spec-driven development and AI-augmented engineering practice, with a measurement framework to track it.</w:t>
       </w:r>
     </w:p>
     <w:p>
@@ -210,57 +202,57 @@
       </w:pPr>
       <w:r>
         <w:rPr>
-          <w:rFonts w:ascii="Calibri" w:cs="Calibri" w:eastAsia="Calibri" w:hAnsi="Calibri"/>
-          <w:color w:val="1A1A1A"/>
-          <w:sz w:val="21"/>
-          <w:szCs w:val="21"/>
-        </w:rPr>
-        <w:t xml:space="preserve">Leading Azure landing-zone migration and the modernization of legacy ASP.NET platforms toward a cloud-native architecture.</w:t>
+          <w:rFonts w:ascii="Helvetica Neue" w:cs="Helvetica Neue" w:eastAsia="Helvetica Neue" w:hAnsi="Helvetica Neue"/>
+          <w:color w:val="161616"/>
+          <w:sz w:val="20"/>
+          <w:szCs w:val="20"/>
+        </w:rPr>
+        <w:t xml:space="preserve">Setting software and cloud architecture direction, moving legacy platforms toward a cloud-native, distributed architecture on Azure.</w:t>
       </w:r>
     </w:p>
     <w:p>
       <w:pPr>
         <w:tabs>
-          <w:tab w:val="right" w:pos="9026"/>
+          <w:tab w:val="right" w:pos="10080"/>
         </w:tabs>
         <w:spacing w:after="0" w:before="80"/>
       </w:pPr>
       <w:r>
         <w:rPr>
-          <w:rFonts w:ascii="Calibri" w:cs="Calibri" w:eastAsia="Calibri" w:hAnsi="Calibri"/>
-          <w:b/>
-          <w:bCs/>
-          <w:color w:val="1A1A1A"/>
-          <w:sz w:val="23"/>
-          <w:szCs w:val="23"/>
+          <w:rFonts w:ascii="Helvetica Neue" w:cs="Helvetica Neue" w:eastAsia="Helvetica Neue" w:hAnsi="Helvetica Neue"/>
+          <w:b/>
+          <w:bCs/>
+          <w:color w:val="161616"/>
+          <w:sz w:val="22"/>
+          <w:szCs w:val="22"/>
         </w:rPr>
         <w:t xml:space="preserve">CTO &amp; VP R&amp;D</w:t>
       </w:r>
       <w:r>
         <w:rPr>
-          <w:rFonts w:ascii="Calibri" w:cs="Calibri" w:eastAsia="Calibri" w:hAnsi="Calibri"/>
-          <w:color w:val="1A1A1A"/>
-          <w:sz w:val="23"/>
-          <w:szCs w:val="23"/>
-        </w:rPr>
-        <w:t xml:space="preserve">  ·  CG Solutions / Groove Technologies</w:t>
-      </w:r>
-      <w:r>
-        <w:rPr>
-          <w:rFonts w:ascii="Calibri" w:cs="Calibri" w:eastAsia="Calibri" w:hAnsi="Calibri"/>
-          <w:sz w:val="23"/>
-          <w:szCs w:val="23"/>
+          <w:rFonts w:ascii="Helvetica Neue" w:cs="Helvetica Neue" w:eastAsia="Helvetica Neue" w:hAnsi="Helvetica Neue"/>
+          <w:color w:val="161616"/>
+          <w:sz w:val="22"/>
+          <w:szCs w:val="22"/>
+        </w:rPr>
+        <w:t xml:space="preserve">  |  CG Solutions / Groove Technologies</w:t>
+      </w:r>
+      <w:r>
+        <w:rPr>
+          <w:rFonts w:ascii="Helvetica Neue" w:cs="Helvetica Neue" w:eastAsia="Helvetica Neue" w:hAnsi="Helvetica Neue"/>
+          <w:sz w:val="22"/>
+          <w:szCs w:val="22"/>
         </w:rPr>
         <w:t xml:space="preserve">	</w:t>
       </w:r>
       <w:r>
         <w:rPr>
-          <w:rFonts w:ascii="Calibri" w:cs="Calibri" w:eastAsia="Calibri" w:hAnsi="Calibri"/>
-          <w:color w:val="555555"/>
-          <w:sz w:val="21"/>
-          <w:szCs w:val="21"/>
-        </w:rPr>
-        <w:t xml:space="preserve">Israel · 2012 – 2025</w:t>
+          <w:rFonts w:ascii="Helvetica Neue" w:cs="Helvetica Neue" w:eastAsia="Helvetica Neue" w:hAnsi="Helvetica Neue"/>
+          <w:color w:val="5A5A5A"/>
+          <w:sz w:val="22"/>
+          <w:szCs w:val="22"/>
+        </w:rPr>
+        <w:t xml:space="preserve">Israel · 2011 – 2025</w:t>
       </w:r>
     </w:p>
     <w:p>
@@ -269,14 +261,14 @@
       </w:pPr>
       <w:r>
         <w:rPr>
-          <w:rFonts w:ascii="Calibri" w:cs="Calibri" w:eastAsia="Calibri" w:hAnsi="Calibri"/>
+          <w:rFonts w:ascii="Helvetica Neue" w:cs="Helvetica Neue" w:eastAsia="Helvetica Neue" w:hAnsi="Helvetica Neue"/>
           <w:i/>
           <w:iCs/>
-          <w:color w:val="555555"/>
-          <w:sz w:val="21"/>
-          <w:szCs w:val="21"/>
-        </w:rPr>
-        <w:t xml:space="preserve">Joined as Gamescale in 2011; promoted to CTO &amp; VP R&amp;D in 2012.</w:t>
+          <w:color w:val="5A5A5A"/>
+          <w:sz w:val="20"/>
+          <w:szCs w:val="20"/>
+        </w:rPr>
+        <w:t xml:space="preserve">Promoted to CTO &amp; VP R&amp;D in 2012.</w:t>
       </w:r>
     </w:p>
     <w:p>
@@ -285,12 +277,12 @@
       </w:pPr>
       <w:r>
         <w:rPr>
-          <w:rFonts w:ascii="Calibri" w:cs="Calibri" w:eastAsia="Calibri" w:hAnsi="Calibri"/>
-          <w:color w:val="1A1A1A"/>
-          <w:sz w:val="21"/>
-          <w:szCs w:val="21"/>
-        </w:rPr>
-        <w:t xml:space="preserve">B2B SaaS platform handling hundreds of millions of daily transactions at 99.99% availability in the regulated real-money gaming sector. Built the engineering organization from 10 to 60 people across R&amp;D, DevOps, IT, NOC, and Product.</w:t>
+          <w:rFonts w:ascii="Helvetica Neue" w:cs="Helvetica Neue" w:eastAsia="Helvetica Neue" w:hAnsi="Helvetica Neue"/>
+          <w:color w:val="161616"/>
+          <w:sz w:val="20"/>
+          <w:szCs w:val="20"/>
+        </w:rPr>
+        <w:t xml:space="preserve">B2B SaaS for the regulated real-money gaming sector, running at 99.99% availability.</w:t>
       </w:r>
     </w:p>
     <w:p>
@@ -304,23 +296,23 @@
       </w:pPr>
       <w:r>
         <w:rPr>
-          <w:rFonts w:ascii="Calibri" w:cs="Calibri" w:eastAsia="Calibri" w:hAnsi="Calibri"/>
-          <w:b/>
-          <w:bCs/>
-          <w:color w:val="1A1A1A"/>
-          <w:sz w:val="21"/>
-          <w:szCs w:val="21"/>
-        </w:rPr>
-        <w:t xml:space="preserve">DORA-elite engineering performance</w:t>
-      </w:r>
-      <w:r>
-        <w:rPr>
-          <w:rFonts w:ascii="Calibri" w:cs="Calibri" w:eastAsia="Calibri" w:hAnsi="Calibri"/>
-          <w:color w:val="1A1A1A"/>
-          <w:sz w:val="21"/>
-          <w:szCs w:val="21"/>
-        </w:rPr>
-        <w:t xml:space="preserve"> reached over six years of focused transformation, measured continuously via Haystack.</w:t>
+          <w:rFonts w:ascii="Helvetica Neue" w:cs="Helvetica Neue" w:eastAsia="Helvetica Neue" w:hAnsi="Helvetica Neue"/>
+          <w:b/>
+          <w:bCs/>
+          <w:color w:val="161616"/>
+          <w:sz w:val="20"/>
+          <w:szCs w:val="20"/>
+        </w:rPr>
+        <w:t xml:space="preserve">Two people to sixty.</w:t>
+      </w:r>
+      <w:r>
+        <w:rPr>
+          <w:rFonts w:ascii="Helvetica Neue" w:cs="Helvetica Neue" w:eastAsia="Helvetica Neue" w:hAnsi="Helvetica Neue"/>
+          <w:color w:val="161616"/>
+          <w:sz w:val="20"/>
+          <w:szCs w:val="20"/>
+        </w:rPr>
+        <w:t xml:space="preserve"> Built it across R&amp;D, DevOps, IT, NOC, and Product: five functions, four sites in Israel and Europe, five direct reports at peak.</w:t>
       </w:r>
     </w:p>
     <w:p>
@@ -334,23 +326,23 @@
       </w:pPr>
       <w:r>
         <w:rPr>
-          <w:rFonts w:ascii="Calibri" w:cs="Calibri" w:eastAsia="Calibri" w:hAnsi="Calibri"/>
-          <w:b/>
-          <w:bCs/>
-          <w:color w:val="1A1A1A"/>
-          <w:sz w:val="21"/>
-          <w:szCs w:val="21"/>
-        </w:rPr>
-        <w:t xml:space="preserve">Greenfield to mission-critical.</w:t>
-      </w:r>
-      <w:r>
-        <w:rPr>
-          <w:rFonts w:ascii="Calibri" w:cs="Calibri" w:eastAsia="Calibri" w:hAnsi="Calibri"/>
-          <w:color w:val="1A1A1A"/>
-          <w:sz w:val="21"/>
-          <w:szCs w:val="21"/>
-        </w:rPr>
-        <w:t xml:space="preserve"> Architected and scaled the platform from zero to hundreds of millions of daily transactions on AWS (EKS, EC2, S3).</w:t>
+          <w:rFonts w:ascii="Helvetica Neue" w:cs="Helvetica Neue" w:eastAsia="Helvetica Neue" w:hAnsi="Helvetica Neue"/>
+          <w:b/>
+          <w:bCs/>
+          <w:color w:val="161616"/>
+          <w:sz w:val="20"/>
+          <w:szCs w:val="20"/>
+        </w:rPr>
+        <w:t xml:space="preserve">Six-year transformation.</w:t>
+      </w:r>
+      <w:r>
+        <w:rPr>
+          <w:rFonts w:ascii="Helvetica Neue" w:cs="Helvetica Neue" w:eastAsia="Helvetica Neue" w:hAnsi="Helvetica Neue"/>
+          <w:color w:val="161616"/>
+          <w:sz w:val="20"/>
+          <w:szCs w:val="20"/>
+        </w:rPr>
+        <w:t xml:space="preserve"> DORA-elite engineering performance, measured continuously via Haystack.</w:t>
       </w:r>
     </w:p>
     <w:p>
@@ -364,23 +356,53 @@
       </w:pPr>
       <w:r>
         <w:rPr>
-          <w:rFonts w:ascii="Calibri" w:cs="Calibri" w:eastAsia="Calibri" w:hAnsi="Calibri"/>
-          <w:b/>
-          <w:bCs/>
-          <w:color w:val="1A1A1A"/>
-          <w:sz w:val="21"/>
-          <w:szCs w:val="21"/>
-        </w:rPr>
-        <w:t xml:space="preserve">Modernization at scale.</w:t>
-      </w:r>
-      <w:r>
-        <w:rPr>
-          <w:rFonts w:ascii="Calibri" w:cs="Calibri" w:eastAsia="Calibri" w:hAnsi="Calibri"/>
-          <w:color w:val="1A1A1A"/>
-          <w:sz w:val="21"/>
-          <w:szCs w:val="21"/>
-        </w:rPr>
-        <w:t xml:space="preserve"> Migrated a monolithic architecture to a high-performance microservices mesh across AWS and hybrid environments.</w:t>
+          <w:rFonts w:ascii="Helvetica Neue" w:cs="Helvetica Neue" w:eastAsia="Helvetica Neue" w:hAnsi="Helvetica Neue"/>
+          <w:b/>
+          <w:bCs/>
+          <w:color w:val="161616"/>
+          <w:sz w:val="20"/>
+          <w:szCs w:val="20"/>
+        </w:rPr>
+        <w:t xml:space="preserve">Greenfield to mission-critical.</w:t>
+      </w:r>
+      <w:r>
+        <w:rPr>
+          <w:rFonts w:ascii="Helvetica Neue" w:cs="Helvetica Neue" w:eastAsia="Helvetica Neue" w:hAnsi="Helvetica Neue"/>
+          <w:color w:val="161616"/>
+          <w:sz w:val="20"/>
+          <w:szCs w:val="20"/>
+        </w:rPr>
+        <w:t xml:space="preserve"> Architected and scaled the platform on AWS from the first line of code, then migrated a monolithic architecture to a microservices mesh without availability impact.</w:t>
+      </w:r>
+    </w:p>
+    <w:p>
+      <w:pPr>
+        <w:pStyle w:val="ListParagraph"/>
+        <w:numPr>
+          <w:ilvl w:val="0"/>
+          <w:numId w:val="2"/>
+        </w:numPr>
+        <w:spacing w:after="60" w:before="0"/>
+      </w:pPr>
+      <w:r>
+        <w:rPr>
+          <w:rFonts w:ascii="Helvetica Neue" w:cs="Helvetica Neue" w:eastAsia="Helvetica Neue" w:hAnsi="Helvetica Neue"/>
+          <w:b/>
+          <w:bCs/>
+          <w:color w:val="161616"/>
+          <w:sz w:val="20"/>
+          <w:szCs w:val="20"/>
+        </w:rPr>
+        <w:t xml:space="preserve">Cost ownership.</w:t>
+      </w:r>
+      <w:r>
+        <w:rPr>
+          <w:rFonts w:ascii="Helvetica Neue" w:cs="Helvetica Neue" w:eastAsia="Helvetica Neue" w:hAnsi="Helvetica Neue"/>
+          <w:color w:val="161616"/>
+          <w:sz w:val="20"/>
+          <w:szCs w:val="20"/>
+        </w:rPr>
+        <w:t xml:space="preserve"> Owned a cloud infrastructure budget reaching USD 1.2M annually across AWS, MongoDB Atlas, and ClickHouse Cloud, and reduced it by up to 25% through sustained FinOps work.</w:t>
       </w:r>
     </w:p>
     <w:p>
@@ -389,10 +411,10 @@
       </w:pPr>
       <w:r>
         <w:rPr>
-          <w:rFonts w:ascii="Calibri" w:cs="Calibri" w:eastAsia="Calibri" w:hAnsi="Calibri"/>
-          <w:b/>
-          <w:bCs/>
-          <w:color w:val="2E5C8A"/>
+          <w:rFonts w:ascii="Helvetica Neue" w:cs="Helvetica Neue" w:eastAsia="Helvetica Neue" w:hAnsi="Helvetica Neue"/>
+          <w:b/>
+          <w:bCs/>
+          <w:color w:val="161616"/>
           <w:sz w:val="22"/>
           <w:szCs w:val="22"/>
         </w:rPr>
@@ -405,32 +427,28 @@
       </w:pPr>
       <w:r>
         <w:rPr>
-          <w:rFonts w:ascii="Calibri" w:cs="Calibri" w:eastAsia="Calibri" w:hAnsi="Calibri"/>
-          <w:color w:val="555555"/>
-          <w:sz w:val="21"/>
-          <w:szCs w:val="21"/>
-        </w:rPr>
-        <w:t xml:space="preserve">Software Team Leader, DoubleVerify · 2010–2011 · Software Engineer, Equitick · 2009–2010 · Team Leader, Microsoft Israel · 2008–2009</w:t>
-      </w:r>
-    </w:p>
-    <w:p>
-      <w:pPr>
-        <w:pBdr>
-          <w:bottom w:val="single" w:color="2E5C8A" w:sz="6" w:space="2"/>
-        </w:pBdr>
-        <w:spacing w:after="40" w:before="140"/>
-      </w:pPr>
-      <w:r>
-        <w:rPr>
-          <w:rFonts w:ascii="Calibri" w:cs="Calibri" w:eastAsia="Calibri" w:hAnsi="Calibri"/>
-          <w:b/>
-          <w:bCs/>
-          <w:color w:val="2E5C8A"/>
-          <w:spacing w:val="40"/>
-          <w:sz w:val="22"/>
-          <w:szCs w:val="22"/>
-        </w:rPr>
-        <w:t xml:space="preserve">TECHNICAL SKILLS</w:t>
+          <w:rFonts w:ascii="Helvetica Neue" w:cs="Helvetica Neue" w:eastAsia="Helvetica Neue" w:hAnsi="Helvetica Neue"/>
+          <w:color w:val="5A5A5A"/>
+          <w:sz w:val="20"/>
+          <w:szCs w:val="20"/>
+        </w:rPr>
+        <w:t xml:space="preserve">Software Team Leader, DoubleVerify · 2010–2011 · Software Engineer, Equitick · 2009–2010 · Team Leader, Microsoft Israel · 2008–2009 · Software Engineer, Oasis Capital Management · 2005–2008 · Team Leader, SeaPass Solutions · 2002–2004</w:t>
+      </w:r>
+    </w:p>
+    <w:p>
+      <w:pPr>
+        <w:spacing w:after="60" w:before="200"/>
+      </w:pPr>
+      <w:r>
+        <w:rPr>
+          <w:rFonts w:ascii="Helvetica Neue" w:cs="Helvetica Neue" w:eastAsia="Helvetica Neue" w:hAnsi="Helvetica Neue"/>
+          <w:b/>
+          <w:bCs/>
+          <w:color w:val="161616"/>
+          <w:sz w:val="26"/>
+          <w:szCs w:val="26"/>
+        </w:rPr>
+        <w:t xml:space="preserve">Technical Skills</w:t>
       </w:r>
     </w:p>
     <w:p>
@@ -439,21 +457,21 @@
       </w:pPr>
       <w:r>
         <w:rPr>
-          <w:rFonts w:ascii="Calibri" w:cs="Calibri" w:eastAsia="Calibri" w:hAnsi="Calibri"/>
-          <w:b/>
-          <w:bCs/>
-          <w:color w:val="1A1A1A"/>
-          <w:sz w:val="21"/>
-          <w:szCs w:val="21"/>
-        </w:rPr>
-        <w:t xml:space="preserve">Engineering &amp; Architecture:  </w:t>
-      </w:r>
-      <w:r>
-        <w:rPr>
-          <w:rFonts w:ascii="Calibri" w:cs="Calibri" w:eastAsia="Calibri" w:hAnsi="Calibri"/>
-          <w:color w:val="1A1A1A"/>
-          <w:sz w:val="21"/>
-          <w:szCs w:val="21"/>
+          <w:rFonts w:ascii="Helvetica Neue" w:cs="Helvetica Neue" w:eastAsia="Helvetica Neue" w:hAnsi="Helvetica Neue"/>
+          <w:b/>
+          <w:bCs/>
+          <w:color w:val="161616"/>
+          <w:sz w:val="20"/>
+          <w:szCs w:val="20"/>
+        </w:rPr>
+        <w:t xml:space="preserve">Architecture &amp; Platform:  </w:t>
+      </w:r>
+      <w:r>
+        <w:rPr>
+          <w:rFonts w:ascii="Helvetica Neue" w:cs="Helvetica Neue" w:eastAsia="Helvetica Neue" w:hAnsi="Helvetica Neue"/>
+          <w:color w:val="161616"/>
+          <w:sz w:val="20"/>
+          <w:szCs w:val="20"/>
         </w:rPr>
         <w:t xml:space="preserve">Distributed systems · Microservices · Event-driven design · High-volume scalability · DDD · DORA · CI/CD · AI-augmented SDLC · FinOps</w:t>
       </w:r>
@@ -464,68 +482,39 @@
       </w:pPr>
       <w:r>
         <w:rPr>
-          <w:rFonts w:ascii="Calibri" w:cs="Calibri" w:eastAsia="Calibri" w:hAnsi="Calibri"/>
-          <w:b/>
-          <w:bCs/>
-          <w:color w:val="1A1A1A"/>
-          <w:sz w:val="21"/>
-          <w:szCs w:val="21"/>
-        </w:rPr>
-        <w:t xml:space="preserve">Cloud &amp; Data:  </w:t>
-      </w:r>
-      <w:r>
-        <w:rPr>
-          <w:rFonts w:ascii="Calibri" w:cs="Calibri" w:eastAsia="Calibri" w:hAnsi="Calibri"/>
-          <w:color w:val="1A1A1A"/>
-          <w:sz w:val="21"/>
-          <w:szCs w:val="21"/>
-        </w:rPr>
-        <w:t xml:space="preserve">AWS (primary) · Azure · Kubernetes · Terraform · MongoDB · Redis · MySQL · ClickHouse · Kafka · Kinesis</w:t>
-      </w:r>
-    </w:p>
-    <w:p>
-      <w:pPr>
-        <w:spacing w:after="60" w:before="40"/>
-      </w:pPr>
-      <w:r>
-        <w:rPr>
-          <w:rFonts w:ascii="Calibri" w:cs="Calibri" w:eastAsia="Calibri" w:hAnsi="Calibri"/>
-          <w:b/>
-          <w:bCs/>
-          <w:color w:val="1A1A1A"/>
-          <w:sz w:val="21"/>
-          <w:szCs w:val="21"/>
-        </w:rPr>
-        <w:t xml:space="preserve">Languages &amp; AI:  </w:t>
-      </w:r>
-      <w:r>
-        <w:rPr>
-          <w:rFonts w:ascii="Calibri" w:cs="Calibri" w:eastAsia="Calibri" w:hAnsi="Calibri"/>
-          <w:color w:val="1A1A1A"/>
-          <w:sz w:val="21"/>
-          <w:szCs w:val="21"/>
-        </w:rPr>
-        <w:t xml:space="preserve">Python · Go · C# · Java · LLM integration · RAG · MCP · Claude Code</w:t>
-      </w:r>
-    </w:p>
-    <w:p>
-      <w:pPr>
-        <w:pBdr>
-          <w:bottom w:val="single" w:color="2E5C8A" w:sz="6" w:space="2"/>
-        </w:pBdr>
-        <w:spacing w:after="40" w:before="140"/>
-      </w:pPr>
-      <w:r>
-        <w:rPr>
-          <w:rFonts w:ascii="Calibri" w:cs="Calibri" w:eastAsia="Calibri" w:hAnsi="Calibri"/>
-          <w:b/>
-          <w:bCs/>
-          <w:color w:val="2E5C8A"/>
-          <w:spacing w:val="40"/>
-          <w:sz w:val="22"/>
-          <w:szCs w:val="22"/>
-        </w:rPr>
-        <w:t xml:space="preserve">EDUCATION</w:t>
+          <w:rFonts w:ascii="Helvetica Neue" w:cs="Helvetica Neue" w:eastAsia="Helvetica Neue" w:hAnsi="Helvetica Neue"/>
+          <w:b/>
+          <w:bCs/>
+          <w:color w:val="161616"/>
+          <w:sz w:val="20"/>
+          <w:szCs w:val="20"/>
+        </w:rPr>
+        <w:t xml:space="preserve">Cloud, Data &amp; AI:  </w:t>
+      </w:r>
+      <w:r>
+        <w:rPr>
+          <w:rFonts w:ascii="Helvetica Neue" w:cs="Helvetica Neue" w:eastAsia="Helvetica Neue" w:hAnsi="Helvetica Neue"/>
+          <w:color w:val="161616"/>
+          <w:sz w:val="20"/>
+          <w:szCs w:val="20"/>
+        </w:rPr>
+        <w:t xml:space="preserve">AWS · Azure · Kubernetes · Terraform · Kafka · ClickHouse · MongoDB · Agentic systems · LLM integration · RAG · MCP · Coding agents · Python · Go · C#</w:t>
+      </w:r>
+    </w:p>
+    <w:p>
+      <w:pPr>
+        <w:spacing w:after="60" w:before="200"/>
+      </w:pPr>
+      <w:r>
+        <w:rPr>
+          <w:rFonts w:ascii="Helvetica Neue" w:cs="Helvetica Neue" w:eastAsia="Helvetica Neue" w:hAnsi="Helvetica Neue"/>
+          <w:b/>
+          <w:bCs/>
+          <w:color w:val="161616"/>
+          <w:sz w:val="26"/>
+          <w:szCs w:val="26"/>
+        </w:rPr>
+        <w:t xml:space="preserve">Education</w:t>
       </w:r>
     </w:p>
     <w:p>
@@ -534,43 +523,39 @@
       </w:pPr>
       <w:r>
         <w:rPr>
-          <w:rFonts w:ascii="Calibri" w:cs="Calibri" w:eastAsia="Calibri" w:hAnsi="Calibri"/>
-          <w:b/>
-          <w:bCs/>
-          <w:color w:val="1A1A1A"/>
-          <w:sz w:val="21"/>
-          <w:szCs w:val="21"/>
+          <w:rFonts w:ascii="Helvetica Neue" w:cs="Helvetica Neue" w:eastAsia="Helvetica Neue" w:hAnsi="Helvetica Neue"/>
+          <w:b/>
+          <w:bCs/>
+          <w:color w:val="161616"/>
+          <w:sz w:val="20"/>
+          <w:szCs w:val="20"/>
         </w:rPr>
         <w:t xml:space="preserve">B.Sc., Information Systems Engineering</w:t>
       </w:r>
       <w:r>
         <w:rPr>
-          <w:rFonts w:ascii="Calibri" w:cs="Calibri" w:eastAsia="Calibri" w:hAnsi="Calibri"/>
-          <w:color w:val="1A1A1A"/>
-          <w:sz w:val="21"/>
-          <w:szCs w:val="21"/>
+          <w:rFonts w:ascii="Helvetica Neue" w:cs="Helvetica Neue" w:eastAsia="Helvetica Neue" w:hAnsi="Helvetica Neue"/>
+          <w:color w:val="161616"/>
+          <w:sz w:val="20"/>
+          <w:szCs w:val="20"/>
         </w:rPr>
         <w:t xml:space="preserve"> · Technion — Israel Institute of Technology · 1998–2002</w:t>
       </w:r>
     </w:p>
     <w:p>
       <w:pPr>
-        <w:pBdr>
-          <w:bottom w:val="single" w:color="2E5C8A" w:sz="6" w:space="2"/>
-        </w:pBdr>
-        <w:spacing w:after="40" w:before="140"/>
-      </w:pPr>
-      <w:r>
-        <w:rPr>
-          <w:rFonts w:ascii="Calibri" w:cs="Calibri" w:eastAsia="Calibri" w:hAnsi="Calibri"/>
-          <w:b/>
-          <w:bCs/>
-          <w:color w:val="2E5C8A"/>
-          <w:spacing w:val="40"/>
-          <w:sz w:val="22"/>
-          <w:szCs w:val="22"/>
-        </w:rPr>
-        <w:t xml:space="preserve">MILITARY SERVICE</w:t>
+        <w:spacing w:after="60" w:before="200"/>
+      </w:pPr>
+      <w:r>
+        <w:rPr>
+          <w:rFonts w:ascii="Helvetica Neue" w:cs="Helvetica Neue" w:eastAsia="Helvetica Neue" w:hAnsi="Helvetica Neue"/>
+          <w:b/>
+          <w:bCs/>
+          <w:color w:val="161616"/>
+          <w:sz w:val="26"/>
+          <w:szCs w:val="26"/>
+        </w:rPr>
+        <w:t xml:space="preserve">Military Service</w:t>
       </w:r>
     </w:p>
     <w:p>
@@ -579,21 +564,21 @@
       </w:pPr>
       <w:r>
         <w:rPr>
-          <w:rFonts w:ascii="Calibri" w:cs="Calibri" w:eastAsia="Calibri" w:hAnsi="Calibri"/>
-          <w:b/>
-          <w:bCs/>
-          <w:color w:val="1A1A1A"/>
-          <w:sz w:val="21"/>
-          <w:szCs w:val="21"/>
+          <w:rFonts w:ascii="Helvetica Neue" w:cs="Helvetica Neue" w:eastAsia="Helvetica Neue" w:hAnsi="Helvetica Neue"/>
+          <w:b/>
+          <w:bCs/>
+          <w:color w:val="161616"/>
+          <w:sz w:val="20"/>
+          <w:szCs w:val="20"/>
         </w:rPr>
         <w:t xml:space="preserve">Investigations Officer</w:t>
       </w:r>
       <w:r>
         <w:rPr>
-          <w:rFonts w:ascii="Calibri" w:cs="Calibri" w:eastAsia="Calibri" w:hAnsi="Calibri"/>
-          <w:color w:val="1A1A1A"/>
-          <w:sz w:val="21"/>
-          <w:szCs w:val="21"/>
+          <w:rFonts w:ascii="Helvetica Neue" w:cs="Helvetica Neue" w:eastAsia="Helvetica Neue" w:hAnsi="Helvetica Neue"/>
+          <w:color w:val="161616"/>
+          <w:sz w:val="20"/>
+          <w:szCs w:val="20"/>
         </w:rPr>
         <w:t xml:space="preserve">, IDF Military Police · 1993–1997 · Led a team of 30.</w:t>
       </w:r>
@@ -804,10 +789,10 @@
   <w:docDefaults>
     <w:rPrDefault>
       <w:rPr>
-        <w:rFonts w:ascii="Calibri" w:cs="Calibri" w:eastAsia="Calibri" w:hAnsi="Calibri"/>
-        <w:color w:val="1A1A1A"/>
-        <w:sz w:val="21"/>
-        <w:szCs w:val="21"/>
+        <w:rFonts w:ascii="Helvetica Neue" w:cs="Helvetica Neue" w:eastAsia="Helvetica Neue" w:hAnsi="Helvetica Neue"/>
+        <w:color w:val="161616"/>
+        <w:sz w:val="20"/>
+        <w:szCs w:val="20"/>
       </w:rPr>
     </w:rPrDefault>
     <w:pPrDefault/>

</xml_diff>